<commit_message>
chore(resume): Update downloadable resume files
Refresh PDF and DOCX to match the latest content.
</commit_message>
<xml_diff>
--- a/public/downloads/Valery_Kharshats_Resume.docx
+++ b/public/downloads/Valery_Kharshats_Resume.docx
@@ -107,7 +107,7 @@
         <w:spacing w:after="60" w:before="0"/>
         <w:jc w:val="center"/>
       </w:pPr>
-      <w:hyperlink w:history="1" r:id="rIdmhzriuseitotlc9xepcjb">
+      <w:hyperlink w:history="1" r:id="rIdqbpqiqbytokpyn9hxbauc">
         <w:r>
           <w:rPr>
             <w:rFonts w:ascii="Calibri" w:cs="Calibri" w:eastAsia="Calibri" w:hAnsi="Calibri"/>
@@ -125,7 +125,7 @@
         <w:spacing w:after="200" w:before="0"/>
         <w:jc w:val="center"/>
       </w:pPr>
-      <w:hyperlink w:history="1" r:id="rIdibnvbjfpe2qpgvlam-zgz">
+      <w:hyperlink w:history="1" r:id="rIdn8n_xjq_egn3nblossqan">
         <w:r>
           <w:rPr>
             <w:rFonts w:ascii="Calibri" w:cs="Calibri" w:eastAsia="Calibri" w:hAnsi="Calibri"/>
@@ -134,7 +134,7 @@
             <w:szCs w:val="21"/>
             <w:u w:val="single"/>
           </w:rPr>
-          <w:t xml:space="preserve">https://cv.valery-kh.workers.dev</w:t>
+          <w:t xml:space="preserve">https://valery-kh.vercel.app</w:t>
         </w:r>
       </w:hyperlink>
     </w:p>

</xml_diff>